<commit_message>
Remove hardware specifics from the paper and reports
Replace RTX 2050, 4 GB VRAM and laptop power details with generic consumer/local GPU wording. Keep the 5-minute chunk removed from the HTML reports as well.

Co-Authored-By: Claude Code <noreply@anthropic.com>
</commit_message>
<xml_diff>
--- a/docs/Matchcall_Paper_v5.docx
+++ b/docs/Matchcall_Paper_v5.docx
@@ -86,7 +86,7 @@
         <w:pStyle w:val="PaperAbstract"/>
       </w:pPr>
       <w:r>
-        <w:t>Automatic football commentary must detect events, identify players and teams, decide what is worth saying, generate grounded language, and voice it in time. Recent systems apply large multimodal models, but they are expensive, difficult to reproduce on consumer hardware, and can hallucinate facts. We present Matchcall, a modular pipeline that keeps deterministic facts separate from surface realisation. A score-bug reader supplies goal anchors; a motion-gated window scan and a ResNet-18 classifier propose other events; YOLO26n with ByteTrack, jersey clustering and possession estimation supply player-level facts; GPT-2 with LoRA generates commentary under a grounding validator with a grounded template as a safety net; Fish Audio synthesises speech. On a 64.5-minute ARG–FRA broadcast, the pipeline produces 43 fully voiced lines in 19.4 minutes on a 4 GB RTX 2050. Both goals are recovered with precision and recall 1.00, but overall event recall against ten curated moments is 0.40 at ±1 minute. On 40 held-out human references, GPT-2 v4 improves ROUGE-L from 0.093 to 0.185 and METEOR from 0.027 to 0.207 over templates, while BLEU-4 remains near zero. The system is pre-recorded only; a deployed live service would need streaming perception and incremental speech. Cloud inference costs $0.39 per match versus an illustrative $300 human team. We conclude that low-cost, auditable pre-recorded commentary is feasible; live commentary and general event spotting remain open.</w:t>
+        <w:t>Automatic football commentary must detect events, identify players and teams, decide what is worth saying, generate grounded language, and voice it in time. Recent systems apply large multimodal models, but they are expensive, difficult to reproduce on consumer hardware, and can hallucinate facts. We present Matchcall, a modular pipeline that keeps deterministic facts separate from surface realisation. A score-bug reader supplies goal anchors; a motion-gated window scan and a ResNet-18 classifier propose other events; YOLO26n with ByteTrack, jersey clustering and possession estimation supply player-level facts; GPT-2 with LoRA generates commentary under a grounding validator with a grounded template as a safety net; Fish Audio synthesises speech. On a 64.5-minute ARG–FRA broadcast, the pipeline produces 43 fully voiced lines in 19.4 minutes on a single consumer GPU. Both goals are recovered with precision and recall 1.00, but overall event recall against ten curated moments is 0.40 at ±1 minute. On 40 held-out human references, GPT-2 v4 improves ROUGE-L from 0.093 to 0.185 and METEOR from 0.027 to 0.207 over templates, while BLEU-4 remains near zero. The system is pre-recorded only; a deployed live service would need streaming perception and incremental speech. Cloud inference costs $0.39 per match versus an illustrative $300 human team. We conclude that low-cost, auditable pre-recorded commentary is feasible; live commentary and general event spotting remain open.</w:t>
       </w:r>
     </w:p>
     <w:p>
@@ -142,7 +142,7 @@
         <w:t>Contributions.</w:t>
       </w:r>
       <w:r>
-        <w:t xml:space="preserve"> (1) A modular five-stage pipeline that separates deterministic facts from language and speech. (2) A score-bug goal anchor that infers the on-screen starting score and survives short clips. (3) A full 64.5-minute end-to-end run with 43 voiced lines on a 4 GB GPU. (4) Three empirical comparisons, including negative results for general event spotting and API event coverage. (5) ClearML-logged training runs and a reproducible evaluation script.</w:t>
+        <w:t xml:space="preserve"> (1) A modular five-stage pipeline that separates deterministic facts from language and speech. (2) A score-bug goal anchor that infers the on-screen starting score and survives short clips. (3) A full 64.5-minute end-to-end run with 43 voiced lines on a single consumer GPU. (4) Three empirical comparisons, including negative results for general event spotting and API event coverage. (5) ClearML-logged training runs and a reproducible evaluation script.</w:t>
       </w:r>
     </w:p>
     <w:p>
@@ -390,7 +390,7 @@
     </w:p>
     <w:p>
       <w:r>
-        <w:t>Table 1 summarises the trained components. YOLO26n was fine-tuned at 640 px for 50 epochs with batch 1 on the RTX 2050; the best checkpoint was the final epoch, with mAP50 0.806 and mAP50–95 0.480. GPT-2 v4 used LoRA rank 32, 160-token sequences, completion-only loss, three epochs and 2,481 optimizer steps; the loss fell from 3.877 to 0.779. A second adapter, v5, used the same base and LoRA rank but the API-slot prompt and a 38,815-example training split (1,723 validation); it ran for 2 epochs and 4,852 steps (1.09 h) and reached a final training loss of 0.903 (ClearML task 6acdac3186d640cc8a398898752dc90a). Fish Audio was used through its free tier, so no paid TTS price is included.</w:t>
+        <w:t>Table 1 summarises the trained components. YOLO26n was fine-tuned at 640 px for 50 epochs with batch 1 on a consumer GPU; the best checkpoint was the final epoch, with mAP50 0.806 and mAP50–95 0.480. GPT-2 v4 used LoRA rank 32, 160-token sequences, completion-only loss, three epochs and 2,481 optimizer steps; the loss fell from 3.877 to 0.779. A second adapter, v5, used the same base and LoRA rank but the API-slot prompt and a 38,815-example training split (1,723 validation); it ran for 2 epochs and 4,852 steps (1.09 h) and reached a final training loss of 0.903 (ClearML task 6acdac3186d640cc8a398898752dc90a). Fish Audio was used through its free tier, so no paid TTS price is included.</w:t>
       </w:r>
     </w:p>
     <w:p>
@@ -405,7 +405,7 @@
         <w:t xml:space="preserve">Table 1. </w:t>
       </w:r>
       <w:r>
-        <w:t>Trained components and schedules. The detector and language models were trained locally on one 4 GB GPU; ClearML logged all runs.</w:t>
+        <w:t>Trained components and schedules. The detector and language models were trained locally on one consumer GPU; ClearML logged all runs.</w:t>
       </w:r>
     </w:p>
     <w:tbl>
@@ -992,7 +992,7 @@
     </w:p>
     <w:p>
       <w:r>
-        <w:t>Inference and training used an NVIDIA RTX 2050 with 4 GB of VRAM. The full-match run, ClearML tasks, model checkpoints, comparison JSON and evaluation scripts are retained in the project repository. The key commands are listed in Appendix A.</w:t>
+        <w:t>Inference and training used a single consumer GPU. The full-match run, ClearML tasks, model checkpoints, comparison JSON and evaluation scripts are retained in the project repository. The key commands are listed in Appendix A.</w:t>
       </w:r>
     </w:p>
     <w:p>
@@ -5229,7 +5229,7 @@
                 <w:b/>
                 <w:sz w:val="16"/>
               </w:rPr>
-              <w:t>Local RTX 2050</w:t>
+              <w:t>Local GPU</w:t>
             </w:r>
           </w:p>
         </w:tc>

</xml_diff>